<commit_message>
Draft_111: expand BOTS closing synthesis, conceptual boundary, and gap/aim
</commit_message>
<xml_diff>
--- a/thesis/003_ThesisProposal_Draft_111_body.docx
+++ b/thesis/003_ThesisProposal_Draft_111_body.docx
@@ -1067,26 +1067,41 @@
         <w:rPr>
           <w:rtl w:val="0"/>
         </w:rPr>
-        <w:t>Across the literature, expert writers show measurable disciplinary differentiation in hedging shaped by epistemic demands rather than a simple hard-or-soft divide (Salager-Meyer, 1994; Afshar et al., 2014; Wang, 2022; Xie &amp; Mi, 2023). Developing researchers across contexts show limited hedge variety and tend to default to modal verbs (Khunasathitchai et al., 2025; Wang, 2022; Ghia et al., 2022; Mazidah et al., 2022; Halabisaz et al., 2014). L2 writers face additional constraints from linguistic factors, publication context, and limited explicit instruction (Demir, 2018; Hu &amp; Cao, 2011; Petchkij, 2019). Philippine and ASEAN studies confirm reliance on modals and, in some contexts, a preference for boosters (Ningrum et al., 2024; Escalona, 2025; Lopez et al., 2025). Abstract-focused work further shows that caution and promotion vary by discipline and ranking (Xie &amp; Mi, 2023), but undergraduate applied-science abstracts remain underdescribed.</w:t>
-      </w:r>
-    </w:p>
-    <w:p>
-      <w:r>
-        <w:t>Definitions of hedging in academic writing are not uniform. Hyland (1998) treats hedges as linguistic means that signal either reduced commitment to the truth of a proposition or a preference not to express that commitment categorically. His polypragmatic model distinguishes content-oriented hedges, which manage accuracy and reliability of the claim, from reader-oriented hedges, which manage interpersonal effects on the audience. Salager-Meyer (1994) frames the same devices as tools for claim-responsibility management. Writers distribute responsibility for a statement’s accuracy among themselves, their data, and external conditions. Crompton (1997) argues that the term is most useful when reserved for epistemic modality attached to knowledge claims, and that extending hedge to every politeness-related feature of academic prose weakens the concept. Those positions leave open whether directives and recommendations, which manage action rather than the truth of a claim, should count as hedges. The present study takes a claim-centered stance. A hedge is coded only when a device changes the writer’s stance toward a proposition that evidence could show to be wrong. Epistemic caution captures reduced commitment to that claim’s truth. Politeness/deference captures interpersonal softening of the same claim. Softened recommendations are logged as false positives under this scope, not as evidence that politeness is absent from the writers’ repertoire.</w:t>
-      </w:r>
-    </w:p>
-    <w:p>
-      <w:pPr>
-        <w:spacing w:after="0" w:before="0" w:line="480" w:lineRule="auto"/>
-        <w:ind w:firstLine="720"/>
-        <w:jc w:val="both"/>
-        <w:rPr/>
-      </w:pPr>
-      <w:r>
-        <w:rPr>
-          <w:rtl w:val="0"/>
-        </w:rPr>
-        <w:t>The empirical gap was checked through searches of Google Scholar, ERIC, and ScienceDirect (2010–2025) using combinations of hedging, hedges, epistemic stance, undergraduate, thesis abstract, research abstract, Agriculture, Veterinary Medicine, Biology, Philippines, and L2, with follow-up citation chaining from key reviews and regional studies cited above. No published study identified in that search has examined hedging in undergraduate thesis abstracts from applied science disciplines in a Philippine L2 context. This study addresses that intersection at PSAU by mapping hedging patterns across three applied life sciences programs that share an institution but differ in their relationship to evidence.</w:t>
+        <w:t>What the review establishes is a set of durable patterns rather than a single ranking of fields. Expert writers adjust hedge density and form mix to the epistemic demands of their work, and that adjustment is visible even inside the short abstract. Density alone does not tell the full story. Form mix, interpersonal orientation, and the move in which a hedge appears also vary by field and by communicative purpose. Developing researchers, including advanced L2 writers, typically work with a smaller set of forms and lean on modals. That restriction holds not only in abstracts, where length pressure is high, but also in longer sections such as discussions, which suggests a developing stance repertoire rather than a pure genre effect. Regional student writing often pairs the modal preference with relatively strong boosting, so caution and certainty marking coexist in the same short texts rather than trading off cleanly.</w:t>
+      </w:r>
+    </w:p>
+    <w:p>
+      <w:r>
+        <w:t>Thesis and dissertation abstracts written by students add a further constraint. Soft-versus-hard density contrasts and program-level differences in interpersonal orientation appear inside that genre, yet almost all of that evidence comes from language, education, or social-science programs. Applied life sciences sit in a different relation to evidence. Claims are often tied to experimental outcomes, clinical observation, or field measurement, and the abstract must still package those claims under strict length limits. The open question is not whether undergraduates hedge at all. It is whether disciplinary differentiation of the kind documented for experts and for student writers in other fields appears inside applied life-science thesis abstracts under Philippine L2 institutional conditions, and whether that differentiation shows up in density, form mix, function, or some combination of the three.</w:t>
+      </w:r>
+    </w:p>
+    <w:p>
+      <w:r>
+        <w:t>That empirical question cannot be answered without a clear boundary on what counts as a hedge. The literature does not share one definition, and the differences matter for coding. Hyland's polypragmatic model keeps both reduced commitment to propositional truth and reader-oriented interpersonal effects inside the same broad category. A single token can manage accuracy and manage the reader at once. Salager-Meyer treats the same devices as ways of distributing claim responsibility among writer, data, and circumstance, which is especially relevant for research writing where findings are provisional. Crompton argues for a narrower scope limited to epistemic modality on knowledge claims, on the ground that stretching hedge to every politeness feature of academic prose weakens the term and blurs what is being counted.</w:t>
+      </w:r>
+    </w:p>
+    <w:p>
+      <w:r>
+        <w:t>Directives and recommendations sit at the edge of that debate. They manage action rather than the truth of a claim. Under a wide interpersonal reading they look like mitigation. Under a claim-centered reading they fall outside the hedge count. This study adopts the claim-centered boundary. A token is retained as a hedge only when it changes the writer's stance toward a proposition that evidence could show to be wrong. Epistemic Caution records reduced commitment to that claim's truth. Politeness/Deference records interpersonal softening of the same claim when that softening co-occurs with, or stands in place of, an epistemic effect on a claim. Softened recommendations are logged as false positives under this scope. The choice is a position in the definitional debate.</w:t>
+      </w:r>
+    </w:p>
+    <w:p>
+      <w:pPr>
+        <w:spacing w:after="0" w:before="0" w:line="480" w:lineRule="auto"/>
+        <w:ind w:firstLine="720"/>
+        <w:jc w:val="both"/>
+        <w:rPr/>
+      </w:pPr>
+      <w:r>
+        <w:rPr>
+          <w:rtl w:val="0"/>
+        </w:rPr>
+        <w:t>The empirical gap was checked through searches of Google Scholar, ERIC, and ScienceDirect (2010–2025) using combinations of hedging, hedges, epistemic stance, undergraduate, thesis abstract, research abstract, Agriculture, Veterinary Medicine, Biology, Philippines, and L2, with follow-up citation chaining from key reviews and regional studies cited above. No published study identified in that search has examined hedging in undergraduate thesis abstracts from applied science disciplines in a Philippine L2 context.</w:t>
+      </w:r>
+    </w:p>
+    <w:p>
+      <w:r>
+        <w:t>The present study takes up that intersection at PSAU. It maps hedge type, density, and function across three applied life sciences programs that share one institution and one L2 medium but differ in how closely their claims are tied to experimental and clinical evidence. Agriculture, Veterinary Medicine, and Biology are treated as a local comparison set rather than as proxies for a global hard-or-soft divide. The aim is descriptive and comparative within that set: to show what hedge patterns appear in ratified undergraduate abstracts in these programs, and to read those patterns against the definitional and disciplinary background laid out above.</w:t>
       </w:r>
     </w:p>
     <w:p>

</xml_diff>

<commit_message>
Draft_111: justify alignment on expanded BOTS body paragraphs
</commit_message>
<xml_diff>
--- a/thesis/003_ThesisProposal_Draft_111_body.docx
+++ b/thesis/003_ThesisProposal_Draft_111_body.docx
@@ -1027,31 +1027,49 @@
       </w:r>
     </w:p>
     <w:p>
+      <w:pPr>
+        <w:jc w:val="both"/>
+      </w:pPr>
       <w:r>
         <w:t>Thesis and dissertation abstracts written by developing researchers add a second layer. Wahyuningsih and Sofwan (2014) analyzed hedges in graduate thesis abstracts at Semarang State University across five programs: English, Mathematics, Science, Social, and Education Management. Lexical hedges were coded with Salager-Meyer's (1994) and Hyland's (1998) taxonomies, and non-lexical forms followed Navratilova (2013). English, Social, and Education Management abstracts used more hedges than Mathematics and Science. English led the lexical counts. Agentless passives were the dominant non-lexical form in every program. The authors link higher soft-field density to interpretive claims and lower hard-field density to measurement-based reporting. The study shows that disciplinary contrast appears inside the thesis abstract even when writers share one institution and one L2 medium.</w:t>
       </w:r>
     </w:p>
     <w:p>
+      <w:pPr>
+        <w:jc w:val="both"/>
+      </w:pPr>
       <w:r>
         <w:t>Demanou and Tabe (2022) examined hedging in DIPES II dissertation abstracts at the Higher Teachers' Training College of Maroua across Bilingual Letters, English, Geography, and History. A specialized corpus of 46,368 tokens was searched with AntConc. Overall hedge density was low, about 2.6% of tokens. Markers of intentional vagueness, accuracy hedges, and writer-oriented hedges were the most common types. Students relied mainly on simpler forms such as some, few, many, could, and a number of. More complex frames such as it appears that were almost absent. Bilingual Letters abstracts were the most tentative, followed by English, Geography, and History. Across communicative moves, the findings and results move carried the densest hedging, especially writer-oriented forms that distance the writer from the claim. The study treats hedging as both discipline-specific and move-specific inside the abstract.</w:t>
       </w:r>
     </w:p>
     <w:p>
+      <w:pPr>
+        <w:jc w:val="both"/>
+      </w:pPr>
       <w:r>
         <w:t>Al-Zarieni and Alkhresheh (2024) studied hedges and boosters in 30 linguistics M.A. thesis abstracts at Yarmouk University, following Hyland's (2005) interpersonal model. Hedges outnumbered boosters (117 to 60, or 66% to 34% of the combined set). Hedges were read as ways of limiting opposition risk, marking politeness, and presenting results cautiously. Boosters were used to assert originality and stress certainty. The study adds an Arabic L2 postgraduate linguistics sample to the abstract-focused record and shows that even language-focused programs still balance caution against certainty marking under abstract constraints.</w:t>
       </w:r>
     </w:p>
     <w:p>
+      <w:pPr>
+        <w:jc w:val="both"/>
+      </w:pPr>
       <w:r>
         <w:t>Mazidah, Cahyani, and Masruroh (2022) compared hedges and boosters in 50 undergraduate thesis abstracts at Qomaruddin University, 25 from English Language Education and 25 from Mathematics, using Hyland's (2005) taxonomy. English abstracts used more hedges. Mathematics abstracts used more boosters. The soft-versus-hard contrast in the same undergraduate thesis-abstract genre matches the graduate pattern reported by Wahyuningsih and Sofwan (2014).</w:t>
       </w:r>
     </w:p>
     <w:p>
+      <w:pPr>
+        <w:jc w:val="both"/>
+      </w:pPr>
       <w:r>
         <w:t>Chafidha and Mujiyanto (2021) compared hedges in thirty master's thesis abstracts from the English and Indonesian graduate programs at Universitas Negeri Semarang, coded with Hyland's (1998) polypragmatic model. Writer-oriented, accuracy-oriented, and reader-oriented hedges appeared in both programs. English abstracts used more writer-oriented hedges, which distance the writer from the proposition. Indonesian abstracts used more reader-oriented hedges, which engage the audience. The study shows that program language focus can shape interpersonal orientation even when hedge functions themselves look similar.</w:t>
       </w:r>
     </w:p>
     <w:p>
+      <w:pPr>
+        <w:jc w:val="both"/>
+      </w:pPr>
       <w:r>
         <w:t>Expert abstract conventions are therefore relatively well mapped for selected linguistic features and for caution versus promotion. Developing-researcher thesis abstracts show a recurring soft-versus-hard density contrast, a preference for simpler hedge forms, and program-level differences in interpersonal orientation. Most of that work still centers on language, education, or social-science programs. Whether undergraduates in applied life sciences show any disciplinary differentiation in this genre remains an open empirical question.</w:t>
       </w:r>
@@ -1071,16 +1089,25 @@
       </w:r>
     </w:p>
     <w:p>
+      <w:pPr>
+        <w:jc w:val="both"/>
+      </w:pPr>
       <w:r>
         <w:t>Thesis and dissertation abstracts written by students add a further constraint. Soft-versus-hard density contrasts and program-level differences in interpersonal orientation appear inside that genre, yet almost all of that evidence comes from language, education, or social-science programs. Applied life sciences sit in a different relation to evidence. Claims are often tied to experimental outcomes, clinical observation, or field measurement, and the abstract must still package those claims under strict length limits. The open question is not whether undergraduates hedge at all. It is whether disciplinary differentiation of the kind documented for experts and for student writers in other fields appears inside applied life-science thesis abstracts under Philippine L2 institutional conditions, and whether that differentiation shows up in density, form mix, function, or some combination of the three.</w:t>
       </w:r>
     </w:p>
     <w:p>
+      <w:pPr>
+        <w:jc w:val="both"/>
+      </w:pPr>
       <w:r>
         <w:t>That empirical question cannot be answered without a clear boundary on what counts as a hedge. The literature does not share one definition, and the differences matter for coding. Hyland's polypragmatic model keeps both reduced commitment to propositional truth and reader-oriented interpersonal effects inside the same broad category. A single token can manage accuracy and manage the reader at once. Salager-Meyer treats the same devices as ways of distributing claim responsibility among writer, data, and circumstance, which is especially relevant for research writing where findings are provisional. Crompton argues for a narrower scope limited to epistemic modality on knowledge claims, on the ground that stretching hedge to every politeness feature of academic prose weakens the term and blurs what is being counted.</w:t>
       </w:r>
     </w:p>
     <w:p>
+      <w:pPr>
+        <w:jc w:val="both"/>
+      </w:pPr>
       <w:r>
         <w:t>Directives and recommendations sit at the edge of that debate. They manage action rather than the truth of a claim. Under a wide interpersonal reading they look like mitigation. Under a claim-centered reading they fall outside the hedge count. This study adopts the claim-centered boundary. A token is retained as a hedge only when it changes the writer's stance toward a proposition that evidence could show to be wrong. Epistemic Caution records reduced commitment to that claim's truth. Politeness/Deference records interpersonal softening of the same claim when that softening co-occurs with, or stands in place of, an epistemic effect on a claim. Softened recommendations are logged as false positives under this scope. The choice is a position in the definitional debate.</w:t>
       </w:r>
@@ -1100,6 +1127,9 @@
       </w:r>
     </w:p>
     <w:p>
+      <w:pPr>
+        <w:jc w:val="both"/>
+      </w:pPr>
       <w:r>
         <w:t>The present study takes up that intersection at PSAU. It maps hedge type, density, and function across three applied life sciences programs that share one institution and one L2 medium but differ in how closely their claims are tied to experimental and clinical evidence. Agriculture, Veterinary Medicine, and Biology are treated as a local comparison set rather than as proxies for a global hard-or-soft divide. The aim is descriptive and comparative within that set: to show what hedge patterns appear in ratified undergraduate abstracts in these programs, and to read those patterns against the definitional and disciplinary background laid out above.</w:t>
       </w:r>

</xml_diff>

<commit_message>
Draft_111: replace cohort and informal wording with formal academic terms
</commit_message>
<xml_diff>
--- a/thesis/003_ThesisProposal_Draft_111_body.docx
+++ b/thesis/003_ThesisProposal_Draft_111_body.docx
@@ -567,7 +567,7 @@
           <w:sz w:val="22"/>
           <w:rtl w:val="0"/>
         </w:rPr>
-        <w:t>Studies of developing researchers converge on a restricted hedging repertoire, but the evidence is not a single undifferentiated claim. Khunasathitchai et al. (2025) analyzed move structure and hedge use in 60 research paper abstracts written by Thai EFL English-majored undergraduates. Three moves were obligatory in their sample: presenting the research, describing the methodology, and summarizing the findings. Hedges appeared in the moves that present the research, summarize findings, and discuss the study, not evenly across the abstract. Modal verbs were the most frequent hedge type, followed by epistemic lexical verbs and epistemic adverbs, while epistemic adjectives were rare and epistemic nouns were absent. The inventory is therefore small and modal-heavy even in a language-major cohort writing the high-stakes abstract genre. Suratno and Aydawati (2025) shift the lens to discussion sections of non-science undergraduate theses. Using a corpus of 30 theses (over 100,000 words), they found that student writers relied heavily on the modal dapat compared with other hedging devices. That concentration suggests limited familiarity with a wider hedge set. Because discussion sections offer more rhetorical space than abstracts, the finding is telling: restricted variety is not only a product of length pressure. It also reflects a developing stance repertoire that has not yet branched into the fuller range of forms common in expert writing.</w:t>
+        <w:t>Studies of developing researchers converge on a restricted hedging repertoire, but the evidence is not a single undifferentiated claim. Khunasathitchai et al. (2025) analyzed move structure and hedge use in 60 research paper abstracts written by Thai EFL English-majored undergraduates. Three moves were obligatory in their sample: presenting the research, describing the methodology, and summarizing the findings. Hedges appeared in the moves that present the research, summarize findings, and discuss the study, not evenly across the abstract. Modal verbs were the most frequent hedge type, followed by epistemic lexical verbs and epistemic adverbs, while epistemic adjectives were rare and epistemic nouns were absent. The inventory is therefore small and modal-heavy even in a language-major sample writing the high-stakes abstract genre. Suratno and Aydawati (2025) shift the lens to discussion sections of non-science undergraduate theses. Using a corpus of 30 theses (over 100,000 words), they found that student writers relied heavily on the modal dapat compared with other hedging devices. That concentration suggests limited familiarity with a wider hedge set. Because discussion sections offer more rhetorical space than abstracts, the finding is telling: restricted variety is not only a product of length pressure. It also reflects a developing stance repertoire that has not yet branched into the fuller range of forms common in expert writing.</w:t>
       </w:r>
     </w:p>
     <w:p>
@@ -887,7 +887,7 @@
         <w:rPr>
           <w:rFonts w:ascii="Georgia" w:hAnsi="Georgia" w:cs="Georgia"/>
         </w:rPr>
-        <w:t>Instructional research points in the same direction. Petchkij (2019) argues that explicit teaching of hedges can raise their use in Thai EFL contexts, though modal forms often remain dominant. Loi and Lim (2015) analysed hedging orientations in discussion sections from the Journal of English for Academic Purposes and elicited specialist-informant views on L2 difficulty. Informants attributed second-language learners' inability to modulate claims to socio-cultural factors, classroom instruction, disciplinary culture, and disciplinary appeals, and stressed that pragmatic fluency in hedging is teachable rather than automatic. Ningrum et al. (2024) document limited hedge inventories and a preference for boosters among ASEAN EFL learners writing academic texts. Lopez et al. (2025) and Escalona (2025) extend the Philippine and college-essay evidence on caution, certainty, and proficiency-related patterns in student writing. Since the present study does not measure English proficiency independently, observed patterns in the PSAU corpus may reflect L2 constraints, disciplinary socialization, instructional history, or some combination of these. The aim is a descriptive baseline of how stance is worded in ratified undergraduate thesis abstracts, not a test of which single factor causes the pattern.</w:t>
+        <w:t>Instructional research points in the same direction. Petchkij (2019) argues that explicit teaching of hedges can raise their use in Thai EFL contexts, though modal forms often remain dominant. Loi and Lim (2015) analysed hedging orientations in discussion sections from the Journal of English for Academic Purposes and elicited specialist views on L2 difficulty. Those specialists attributed second-language learners' inability to modulate claims to socio-cultural factors, classroom instruction, disciplinary culture, and disciplinary appeals, and stressed that pragmatic fluency in hedging is teachable rather than automatic. Ningrum et al. (2024) document limited hedge inventories and a preference for boosters among ASEAN EFL learners writing academic texts. Lopez et al. (2025) and Escalona (2025) extend the Philippine and college-essay evidence on caution, certainty, and proficiency-related patterns in student writing. Since the present study does not measure English proficiency independently, observed patterns in the PSAU corpus may reflect L2 constraints, disciplinary socialization, instructional history, or some combination of these. The aim is a descriptive baseline of how stance is worded in ratified undergraduate thesis abstracts, not a test of which single factor causes the pattern.</w:t>
       </w:r>
     </w:p>
     <w:p>
@@ -2462,7 +2462,7 @@
           <w:bCs w:val="1"/>
           <w:rtl w:val="0"/>
         </w:rPr>
-        <w:t>e. Data Analysis. Hedge identification, type classification, and functional coding were all conducted manually using a Google Sheets coding template. Each abstract was read in full before coding began to ensure hedges were interpreted in context rather than flagged as isolated tokens. Ambiguous cases were resolved using the predefined decision tree in Appendix A. Frequency counts were normalized per 100 words to enable comparison across abstracts of varying length. In a separate pass, each abstract was also coded for outcome type from its results language (Binary, Continuous, Mixed, Null/NS, Other), so that density patterns could be read against the kind of finding reported. Those codes are recorded in the coding spreadsheet and discussed in Part IV. While the quantitative analysis identified what hedges were used, the qualitative interpretation applied Salager-Meyer’s (1994) claim-responsibility framework and Hyland’s (2005) stance model to explain why these patterns occurred. Given the corpus size, findings were interpreted as indicative patterns within the PSAU context.</w:t>
+        <w:t>e. Data Analysis. Hedge identification, type classification, and functional coding were all conducted manually using a Google Sheets coding template. Each abstract was read in full before coding began to ensure hedges were interpreted in context rather than flagged as isolated tokens. Ambiguous cases were resolved using the predefined decision tree in Appendix A. Frequency counts were normalized per 100 words to enable comparison across abstracts of varying length. In a separate pass, each abstract was also coded for outcome type from its results language (Binary, Continuous, Mixed, Null/NS, Other), so that density patterns could be read against the type of finding reported. Those codes are recorded in the coding spreadsheet and discussed in Part IV. While the quantitative analysis identified what hedges were used, the qualitative interpretation applied Salager-Meyer’s (1994) claim-responsibility framework and Hyland’s (2005) stance model to explain why these patterns occurred. Given the corpus size, findings were interpreted as indicative patterns within the PSAU context.</w:t>
       </w:r>
     </w:p>
     <w:p>
@@ -6661,7 +6661,7 @@
         <w:rPr>
           <w:rtl w:val="0"/>
         </w:rPr>
-        <w:t xml:space="preserve">Additionally, 14 unhedged assertions were identified where caution was warranted but absent. Of these, 9 were generalizations beyond the data [G] and 5 were causal claims stated more strongly than the design alone supports [C]. Twelve of the 14 fall in zero-hedge abstracts. Bare trial results and measured findings are not counted: a hedge could often be inserted there without changing the facts, but caution is not required for routine results reporting. The unhedged-assertion inventory therefore answers how often writers left out caution where it was actually warranted, not how many assertion slots exist in the corpus.</w:t>
+        <w:t>Additionally, 14 unhedged assertions were identified where caution was warranted but absent. Of these, 9 were generalizations beyond the data [G] and 5 were causal claims stated more strongly than the design alone supports [C]. Twelve of the 14 fall in zero-hedge abstracts. Bare trial results and measured findings are not counted: a hedge could often be inserted there without changing the facts, but caution is not required for routine results reporting. The unhedged-assertion inventory therefore answers how often writers left out caution where it was warranted, not how many assertion slots exist in the corpus.</w:t>
       </w:r>
     </w:p>
     <w:p>
@@ -9919,7 +9919,7 @@
         <w:rPr>
           <w:rtl w:val="0"/>
         </w:rPr>
-        <w:t xml:space="preserve">, with modal verbs as the other main resource. Instruction that assumes a full academic hedging repertoire will miss what this campus sample actually shows. Classroom tasks may instead train students to match the strength of a claim to the strength of the evidence in the same sentence.</w:t>
+        <w:t>, with modal verbs as the other main resource. Instruction that assumes a full academic hedging repertoire will miss what this campus sample shows. Classroom tasks may instead train students to match the strength of a claim to the strength of the evidence in the same sentence.</w:t>
       </w:r>
     </w:p>
     <w:p>

</xml_diff>

<commit_message>
Draft_111: soften deficit framing; prefer L1/L2 over native/non-native in authorial prose
</commit_message>
<xml_diff>
--- a/thesis/003_ThesisProposal_Draft_111_body.docx
+++ b/thesis/003_ThesisProposal_Draft_111_body.docx
@@ -617,7 +617,7 @@
           <w:rFonts w:ascii="Georgia" w:hAnsi="Georgia" w:eastAsia="Georgia"/>
           <w:sz w:val="22"/>
         </w:rPr>
-        <w:t>Halabisaz et al. (2014) focus the comparison on thesis abstracts in applied linguistics. They sampled 300 master’s abstracts written between 2000 and 2013, split between native English writers and Iranian non-native writers, and coded hedges according to Crompton’s (1997) taxonomy. Native English writers used more hedging devices overall. Non-native writers used fewer. The authors attribute the difference to rhetorical sensitivity, modality, awareness of audience and purpose, and cultural background. Because the unit of analysis is the thesis abstract, the study sits closer to the present design than full-paper comparisons do. It also shows that L1–L2 differences in hedging can appear even among writers who have completed substantial graduate coursework in a language-related field.</w:t>
+        <w:t>Halabisaz et al. (2014) focus the comparison on thesis abstracts in applied linguistics. They sampled 300 master’s abstracts written between 2000 and 2013, split between English L1 writers and Iranian L2 writers, and coded hedges according to Crompton’s (1997) taxonomy. English L1 writers used more hedging devices overall. L2 writers used fewer. The authors attribute the difference to rhetorical sensitivity, modality, awareness of audience and purpose, and cultural background. Because the unit of analysis is the thesis abstract, the study sits closer to the present design than full-paper comparisons do. It also shows that L1–L2 differences in hedging can appear even among writers who have completed substantial graduate coursework in a language-related field.</w:t>
       </w:r>
     </w:p>
     <w:p>
@@ -835,7 +835,7 @@
         <w:rPr>
           <w:rFonts w:ascii="Georgia" w:hAnsi="Georgia" w:cs="Georgia"/>
         </w:rPr>
-        <w:t>Hinkel (2005) sharpens the formal picture with a large student-essay corpus of 745 essays and about 221,000 words. Non-native writers used a severely limited range of hedging devices, many of them associated with conversational rather than formal written discourse. The same essays showed a prevalence of conversational intensifiers and overstatements that are common in informal speech but rare in academic prose. Demir (2018) compared lexical hedges in academic texts by native and non-native writers of English and reported significant differences across modal, verbal, adjectival, adverbial, quantifier, and noun hedges, as well as in total hedge use. Taken together, these studies show that the L2 issue is not only density. It is range, register, and the balance between caution and overstatement.</w:t>
+        <w:t>Hinkel (2005) sharpens the formal picture with a large student-essay corpus of 745 essays and about 221,000 words. L2 writers used a limited range of hedging devices, many of them associated with conversational rather than formal written discourse. The same essays showed a prevalence of conversational intensifiers and overstatements that are common in informal speech but rare in academic prose. Demir (2018) compared lexical hedges in academic texts by English L1 and L2 writers and reported significant differences across modal, verbal, adjectival, adverbial, quantifier, and noun hedges, as well as in total hedge use. Taken together, these studies show that the L2 issue is not only density. It is range, register, and the balance between caution and overstatement.</w:t>
       </w:r>
     </w:p>
     <w:p>
@@ -848,7 +848,7 @@
         <w:rPr>
           <w:rFonts w:ascii="Georgia" w:hAnsi="Georgia" w:cs="Georgia"/>
         </w:rPr>
-        <w:t>Takimoto (2015) adds a recognition layer. In a corpus comparison of academic essays by Japanese EFL learners and native speakers of English, the EFL group used more boosters than hedges and preferred straightforward, explicit expressions, whereas native writers were more tentative. A follow-up task suggested that certainty items were more visible to the learners than possibility and probability items, which they often misapprehended. Underuse of hedges can therefore coexist with limited pragmatic awareness of what the missing forms do. Luo (2021), in a systematic review of undergraduate English language learners' hedging, reaches a similar aggregate conclusion. ELLs generally use fewer hedges than native speakers, draw on a narrower inventory, and face combined challenges of academic experience and L2 form control.</w:t>
+        <w:t>Takimoto (2015) adds a recognition layer. In a corpus comparison of academic essays by Japanese EFL learners and English L1 writers, the EFL group used more boosters than hedges and preferred straightforward, explicit expressions, whereas native writers were more tentative. A follow-up task suggested that certainty items were more visible to the learners than possibility and probability items, which they often misapprehended. Underuse of hedges can therefore coexist with limited pragmatic awareness of what the missing forms do. Luo (2021), in a systematic review of undergraduate English language learners' hedging, reaches a similar aggregate conclusion. ELLs generally use fewer hedges than English L1 writers, draw on a narrower inventory, and face combined challenges of academic experience and L2 form control.</w:t>
       </w:r>
     </w:p>
     <w:p>
@@ -861,7 +861,7 @@
         <w:rPr>
           <w:rFonts w:ascii="Georgia" w:hAnsi="Georgia" w:cs="Georgia"/>
         </w:rPr>
-        <w:t>Alonso (2019) approaches the same problem through a multicompetence design rather than an L2-only comparison. She examined hedges in academic writing by 24 Spanish learners of English, collecting data from the same participants in both Spanish and English, and compared them with monolingual Spanish and monolingual English control groups of 24 speakers each. Hedges were coded following Hyland's (1994) typology. Chi-square analyses showed differences between English and Spanish speakers, and between English speakers and L2 learners, especially in impersonal expressions and lexical verbs. Evidence of crosslinguistic influence appeared, and similarity in the use of adverbs across the learners' L1 and L2 pointed to L1-L2 convergence. The design matters for the present study because it shows that L2 hedging patterns cannot be read as a pure deficit against native English norms without also considering the writer's full language system. Publication medium and cultural writing tradition can widen the same gap. Hu and Cao (2011) found that applied-linguistics abstracts in English-medium journals carried markedly more hedges than those in Chinese-medium journals, a difference they link jointly to rhetorical convention and epistemological belief. Halabisaz et al. (2014) attributed native-non-native differences in applied-linguistics master's abstracts to rhetorical sensitivity and cultural background as well as to form.</w:t>
+        <w:t>Alonso (2019) approaches the same problem through a multicompetence design rather than an L2-only comparison. She examined hedges in academic writing by 24 Spanish learners of English, collecting data from the same participants in both Spanish and English, and compared them with monolingual Spanish and monolingual English control groups of 24 speakers each. Hedges were coded following Hyland's (1994) typology. Chi-square analyses showed differences between English and Spanish speakers, and between English speakers and L2 learners, especially in impersonal expressions and lexical verbs. Evidence of crosslinguistic influence appeared, and similarity in the use of adverbs across the learners' L1 and L2 pointed to L1-L2 convergence. The design matters for the present study because it shows that L2 hedging patterns cannot be read as a pure deficit against English L1 norms without also considering the writer's full language system. Publication medium and cultural writing tradition can widen the same gap. Hu and Cao (2011) found that applied-linguistics abstracts in English-medium journals carried markedly more hedges than those in Chinese-medium journals, a difference they link jointly to rhetorical convention and epistemological belief. Halabisaz et al. (2014) attributed L1–L2 differences in applied-linguistics master's abstracts to rhetorical sensitivity and cultural background as well as to form.</w:t>
       </w:r>
     </w:p>
     <w:p>
@@ -887,7 +887,7 @@
         <w:rPr>
           <w:rFonts w:ascii="Georgia" w:hAnsi="Georgia" w:cs="Georgia"/>
         </w:rPr>
-        <w:t>Instructional research points in the same direction. Petchkij (2019) argues that explicit teaching of hedges can raise their use in Thai EFL contexts, though modal forms often remain dominant. Loi and Lim (2015) analysed hedging orientations in discussion sections from the Journal of English for Academic Purposes and elicited specialist views on L2 difficulty. Those specialists attributed second-language learners' inability to modulate claims to socio-cultural factors, classroom instruction, disciplinary culture, and disciplinary appeals, and stressed that pragmatic fluency in hedging is teachable rather than automatic. Ningrum et al. (2024) document limited hedge inventories and a preference for boosters among ASEAN EFL learners writing academic texts. Lopez et al. (2025) and Escalona (2025) extend the Philippine and college-essay evidence on caution, certainty, and proficiency-related patterns in student writing. Since the present study does not measure English proficiency independently, observed patterns in the PSAU corpus may reflect L2 constraints, disciplinary socialization, instructional history, or some combination of these. The aim is a descriptive baseline of how stance is worded in ratified undergraduate thesis abstracts, not a test of which single factor causes the pattern.</w:t>
+        <w:t>Instructional research points in the same direction. Petchkij (2019) argues that explicit teaching of hedges can raise their use in Thai EFL contexts, though modal forms often remain dominant. Loi and Lim (2015) analysed hedging orientations in discussion sections from the Journal of English for Academic Purposes and elicited specialist views on L2 difficulty. Those specialists attributed second-language learners' difficulty modulating claims to socio-cultural factors, classroom instruction, disciplinary culture, and disciplinary appeals, and stressed that pragmatic fluency in hedging is teachable rather than automatic. Ningrum et al. (2024) document limited hedge inventories and a preference for boosters among ASEAN EFL learners writing academic texts. Lopez et al. (2025) and Escalona (2025) extend the Philippine and college-essay evidence on caution, certainty, and proficiency-related patterns in student writing. Since the present study does not measure English proficiency independently, observed patterns in the PSAU corpus may reflect L2 constraints, disciplinary socialization, instructional history, or some combination of these. The aim is a descriptive baseline of how stance is worded in ratified undergraduate thesis abstracts, not a test of which single factor causes the pattern.</w:t>
       </w:r>
     </w:p>
     <w:p>

</xml_diff>

<commit_message>
Draft_111: BOTS full pass dedupe repeated authors across themes
</commit_message>
<xml_diff>
--- a/thesis/003_ThesisProposal_Draft_111_body.docx
+++ b/thesis/003_ThesisProposal_Draft_111_body.docx
@@ -861,7 +861,7 @@
         <w:rPr>
           <w:rFonts w:ascii="Georgia" w:hAnsi="Georgia" w:cs="Georgia"/>
         </w:rPr>
-        <w:t>Alonso (2019) approaches the same problem through a multicompetence design rather than an L2-only comparison. She examined hedges in academic writing by 24 Spanish learners of English, collecting data from the same participants in both Spanish and English, and compared them with monolingual Spanish and monolingual English control groups of 24 speakers each. Hedges were coded following Hyland's (1994) typology. Chi-square analyses showed differences between English and Spanish speakers, and between English speakers and L2 learners, especially in impersonal expressions and lexical verbs. Evidence of crosslinguistic influence appeared, and similarity in the use of adverbs across the learners' L1 and L2 pointed to L1-L2 convergence. The design matters for the present study because it shows that L2 hedging patterns cannot be read as a pure deficit against English L1 norms without also considering the writer's full language system. Publication medium and cultural writing tradition can widen the same gap. Hu and Cao (2011) found that applied-linguistics abstracts in English-medium journals carried markedly more hedges than those in Chinese-medium journals, a difference they link jointly to rhetorical convention and epistemological belief. Halabisaz et al. (2014) attributed L1–L2 differences in applied-linguistics master's abstracts to rhetorical sensitivity and cultural background as well as to form.</w:t>
+        <w:t>Alonso (2019) approaches the same problem through a multicompetence design rather than an L2-only comparison. She examined hedges in academic writing by 24 Spanish learners of English, collecting data from the same participants in both Spanish and English, and compared them with monolingual Spanish and monolingual English control groups of 24 speakers each. Hedges were coded following Hyland's (1994) typology. Chi-square analyses showed differences between English and Spanish speakers, and between English speakers and L2 learners, especially in impersonal expressions and lexical verbs. Evidence of crosslinguistic influence appeared, and similarity in the use of adverbs across the learners' L1 and L2 pointed to L1-L2 convergence. The design matters for the present study because it shows that L2 hedging patterns cannot be read as a pure deficit against English L1 norms without also considering the writer's full language system. Publication medium and cultural writing tradition can widen the same gap. Hu and Cao (2011) found that applied-linguistics abstracts in English-medium journals carried markedly more hedges than those in Chinese-medium journals, a difference they link jointly to rhetorical convention and epistemological belief.</w:t>
       </w:r>
     </w:p>
     <w:p>
@@ -874,7 +874,7 @@
         <w:rPr>
           <w:rFonts w:ascii="Georgia" w:hAnsi="Georgia" w:cs="Georgia"/>
         </w:rPr>
-        <w:t>Undergraduate thesis abstracts, the genre closest to the present corpus, show the same L2 pressures. Mazidah et al. (2022) compared hedges and boosters in 50 undergraduate thesis abstracts from English Language Education and Mathematics students at an Indonesian university, using Hyland's (2005) taxonomy. Boosters outnumbered hedges overall, and the authors link heavy booster use and limited hedge variety to incomplete knowledge of English academic rhetoric. Ghia et al. (2022) examined 217 English thesis abstracts by advanced Italian EFL undergraduates and compared them with L1 student writing in MICUSP. The EFL writers used fewer hedges and more boosters and certainty modals than the L1 comparison group, even while displaying partial awareness of academic caution. Bayraktar-Cepni and Kulaksiz (2022) compared hedging in discussion sections of ELT MA and PhD theses and found that MA theses contained significantly more hedges than PhD theses, a difference they link to developing writers' stronger need to soften stance. Level of academic experience, not only L1 versus L2 status, therefore shapes how much caution writers encode.</w:t>
+        <w:t>Undergraduate thesis abstracts, the genre closest to the present corpus, show the same L2 pressures. As reviewed under undergraduate writing, Mazidah et al. (2022) and Ghia et al. (2022) report that L2 thesis abstracts often carry fewer hedges and stronger certainty marking than L1 comparison groups, even among language-oriented programs. Bayraktar-Cepni and Kulaksiz (2022) compared hedging in discussion sections of ELT MA and PhD theses and found that MA theses contained significantly more hedges than PhD theses, a difference they link to developing writers' stronger need to soften stance. Level of academic experience, not only L1 versus L2 status, therefore shapes how much caution writers encode.</w:t>
       </w:r>
     </w:p>
     <w:p>
@@ -887,7 +887,7 @@
         <w:rPr>
           <w:rFonts w:ascii="Georgia" w:hAnsi="Georgia" w:cs="Georgia"/>
         </w:rPr>
-        <w:t>Instructional research points in the same direction. Petchkij (2019) argues that explicit teaching of hedges can raise their use in Thai EFL contexts, though modal forms often remain dominant. Loi and Lim (2015) analysed hedging orientations in discussion sections from the Journal of English for Academic Purposes and elicited specialist views on L2 difficulty. Those specialists attributed second-language learners' difficulty modulating claims to socio-cultural factors, classroom instruction, disciplinary culture, and disciplinary appeals, and stressed that pragmatic fluency in hedging is teachable rather than automatic. Ningrum et al. (2024) document limited hedge inventories and a preference for boosters among ASEAN EFL learners writing academic texts. Lopez et al. (2025) and Escalona (2025) extend the Philippine and college-essay evidence on caution, certainty, and proficiency-related patterns in student writing. Since the present study does not measure English proficiency independently, observed patterns in the PSAU corpus may reflect L2 constraints, disciplinary socialization, instructional history, or some combination of these. The aim is a descriptive baseline of how stance is worded in ratified undergraduate thesis abstracts, not a test of which single factor causes the pattern.</w:t>
+        <w:t>Instructional research points in the same direction. Petchkij (2019) argues that explicit teaching of hedges can raise their use in Thai EFL contexts, though modal forms often remain dominant. Loi and Lim (2015) analysed hedging orientations in discussion sections from the Journal of English for Academic Purposes and elicited specialist views on L2 difficulty. Those specialists attributed second-language learners' difficulty modulating claims to socio-cultural factors, classroom instruction, disciplinary culture, and disciplinary appeals, and stressed that pragmatic fluency in hedging is teachable rather than automatic. Regional ASEAN and Philippine learner studies, taken up in the next section, likewise report limited hedge inventories and frequent booster preference in student academic English (Ningrum et al., 2024; Lopez et al., 2025; Escalona, 2025). Since the present study does not measure English proficiency independently, observed patterns in the PSAU corpus may reflect L2 constraints, disciplinary socialization, instructional history, or some combination of these. The aim is a descriptive baseline of how stance is worded in ratified undergraduate thesis abstracts, not a test of which single factor causes the pattern.</w:t>
       </w:r>
     </w:p>
     <w:p>
@@ -1055,7 +1055,7 @@
         <w:jc w:val="both"/>
       </w:pPr>
       <w:r>
-        <w:t>Mazidah, Cahyani, and Masruroh (2022) compared hedges and boosters in 50 undergraduate thesis abstracts at Qomaruddin University, 25 from English Language Education and 25 from Mathematics, using Hyland's (2005) taxonomy. English abstracts used more hedges. Mathematics abstracts used more boosters. The soft-versus-hard contrast in the same undergraduate thesis-abstract genre matches the graduate pattern reported by Wahyuningsih and Sofwan (2014).</w:t>
+        <w:t>Mazidah et al. (2022), reviewed under undergraduate writing, found a soft-versus-hard contrast in undergraduate thesis abstracts at Qomaruddin University that aligns with the graduate pattern reported by Wahyuningsih and Sofwan (2014). English-education abstracts used more hedges. Mathematics abstracts used more boosters.</w:t>
       </w:r>
     </w:p>
     <w:p>

</xml_diff>

<commit_message>
Draft_111: expand BOTS §2 medical result presentation and claim commitment (Doğan, Lingard, Sepehri)
</commit_message>
<xml_diff>
--- a/thesis/003_ThesisProposal_Draft_111_body.docx
+++ b/thesis/003_ThesisProposal_Draft_111_body.docx
@@ -755,7 +755,31 @@
           <w:rFonts w:ascii="Georgia" w:hAnsi="Georgia" w:eastAsia="Georgia"/>
           <w:sz w:val="22"/>
         </w:rPr>
-        <w:t>Salager-Meyer (1994) anchors much of this comparative work in medical English. In research papers and case reports from leading medical journals, hedge frequency and category distribution shifted with rhetorical section. Discussion and Comment sections were the most heavily hedged. Methods and case-report body sections were among the least. Shields, approximators, and compound hedges accounted for the great majority of devices. Introductions favored shields, especially epistemic verbs, as writers carved an early niche for the study. Hu and Cao (2011) add publication medium and evidence type. In applied-linguistics journal abstracts, English-medium texts featured markedly more hedges than Chinese-medium texts, and empirical research abstracts used significantly more boosters than non-empirical articles. Stance choices therefore track section, medium, and evidence type as well as discipline.</w:t>
+        <w:t>Salager-Meyer (1994) anchors much of this comparative work in medical English. In research papers and case reports from leading medical journals, hedge frequency and category distribution shifted with rhetorical section. Discussion and Comment sections were the most heavily hedged. Methods and case-report body sections were among the least. Shields, approximators, and compound hedges accounted for the great majority of devices. Introductions favored shields, especially epistemic verbs, as writers carved an early niche for the study. That section pattern matters for how medical writers present results. Directly measured findings often remain categorical. Hedging rises where writers move from measurement to interpretation, generalization, or clinical implication. The same medical discourse can therefore look firm in the results strip and still manage claim responsibility in the interpretive strip.</w:t>
+      </w:r>
+    </w:p>
+    <w:p>
+      <w:pPr>
+        <w:jc w:val="both"/>
+      </w:pPr>
+      <w:r>
+        <w:t>Corpus work on medical Results and Discussion sections supports that reading. Doğan and Akbaş (2021) analysed about 215,000 words from the Results and Discussion sections of 100 medical research articles across fields from anatomy to endocrinology. Medical writers used modal auxiliaries frequently to mark stance. They did not rely on a matching surge of boosters to amplify commitment. Where boosters appeared, they were often strategic, used to support credibility and reader engagement rather than as a default claim of certainty. Medical scientific English in those sections is therefore better described as calibrated commitment than as either blanket tentativeness or blanket conviction.</w:t>
+      </w:r>
+    </w:p>
+    <w:p>
+      <w:pPr>
+        <w:jc w:val="both"/>
+      </w:pPr>
+      <w:r>
+        <w:t>Lingard (2026) makes the same point in pedagogical terms for health-professions research writing. High authorial commitment is appropriate when the warrant is strong. Heavy hedging on a well-supported measurement can read as unnecessary softening. Low commitment remains necessary when the claim outruns the data. The issue is match of stance to warrant, not a medical culture of always agreeing or disagreeing more bluntly than other sciences.</w:t>
+      </w:r>
+    </w:p>
+    <w:p>
+      <w:pPr>
+        <w:jc w:val="both"/>
+      </w:pPr>
+      <w:r>
+        <w:t>Cross-field comparisons complicate any simple medical-versus-other ranking. Sepehri, Hajijalili, and Namaziandost (2019) compared hedges and boosters in 30 medical and 30 engineering research articles and found a significant disciplinary difference, with medical articles carrying more hedge tokens overall in their sample. Medical writing is not uniformly under-hedged relative to other technical fields. What remains distinctive is the reporting pattern inside the article: categorical presentation of measured results, denser hedging where interpretation and generalization begin. Hu and Cao (2011) add publication medium and evidence type outside medicine. In applied-linguistics journal abstracts, English-medium texts featured markedly more hedges than Chinese-medium texts, and empirical research abstracts used significantly more boosters than non-empirical articles. Stance choices therefore track section, medium, and evidence type as well as discipline.</w:t>
       </w:r>
     </w:p>
     <w:p>
@@ -783,7 +807,7 @@
           <w:rFonts w:ascii="Georgia" w:hAnsi="Georgia" w:eastAsia="Georgia"/>
           <w:sz w:val="22"/>
         </w:rPr>
-        <w:t>Expert scientific English therefore shows measurable variation, but the variation is local to how each field, section, medium, and publication context handles evidence and claim risk. For developing writers in L2 settings, that expert picture is a target rather than a description of current practice. The present study asks whether PSAU undergraduates in three applied programs already show any of that field-sensitive differentiation in the compressed genre of the thesis abstract.</w:t>
+        <w:t>Expert scientific English therefore shows measurable variation, but the variation is local to how each field, section, medium, and publication context handles evidence and claim risk. In medical and clinical writing, that local pattern includes categorical reporting of measured results and denser hedging when claims move into interpretation. For developing writers in L2 settings, the expert picture is a target rather than a description of current practice. The present study asks whether PSAU undergraduates in three applied programs already show any of that field-sensitive differentiation in the compressed genre of the thesis abstract.</w:t>
       </w:r>
     </w:p>
     <w:p>
@@ -1048,6 +1072,11 @@
       </w:pPr>
       <w:r>
         <w:t>Al-Zarieni and Alkhresheh (2024) studied hedges and boosters in 30 linguistics M.A. thesis abstracts at Yarmouk University, following Hyland's (2005) interpersonal model. Hedges outnumbered boosters (117 to 60, or 66% to 34% of the combined set). Hedges were read as ways of limiting opposition risk, marking politeness, and presenting results cautiously. Boosters were used to assert originality and stress certainty. The study adds an Arabic L2 postgraduate linguistics sample to the abstract-focused record and shows that even language-focused programs still balance caution against certainty marking under abstract constraints.</w:t>
+      </w:r>
+    </w:p>
+    <w:p>
+      <w:r>
+        <w:t>Lingard, L. (2026). Rhetorical candour: When and how to say it straight in your academic manuscript. Perspectives on Medical Education, 15(1), 251–256. https://doi.org/10.5334/pme.2269</w:t>
       </w:r>
     </w:p>
     <w:p>
@@ -10143,6 +10172,11 @@
       </w:r>
     </w:p>
     <w:p>
+      <w:r>
+        <w:t>Doğan, Z. N., &amp; Akbaş, E. (2021). An exploratory study of epistemic stance in results and discussion sections of medical research articles. Atatürk Üniversitesi Sosyal Bilimler Enstitüsü Dergisi, 25(3), 1132–1150. https://doi.org/10.53487/ataunisosbil.951126</w:t>
+      </w:r>
+    </w:p>
+    <w:p>
       <w:pPr>
         <w:spacing w:after="0" w:before="0" w:line="480" w:lineRule="auto"/>
         <w:ind w:left="720" w:hanging="720"/>
@@ -10741,6 +10775,11 @@
         <w:rPr>
           <w:rtl w:val="0"/>
         </w:rPr>
+      </w:r>
+    </w:p>
+    <w:p>
+      <w:r>
+        <w:t>Sepehri, M., Hajijalili, M., &amp; Namaziandost, E. (2019). Hedges and boosters in medical and engineering research articles: A comparative corpus-based study. Global Journal of Foreign Language Teaching, 9(4), 203–213. https://doi.org/10.18844/gjflt.v9i4.4342</w:t>
       </w:r>
     </w:p>
     <w:p>

</xml_diff>

<commit_message>
Draft_111: fix Lingard ref placement; §2 medical stance expansion complete
</commit_message>
<xml_diff>
--- a/thesis/003_ThesisProposal_Draft_111_body.docx
+++ b/thesis/003_ThesisProposal_Draft_111_body.docx
@@ -1072,11 +1072,6 @@
       </w:pPr>
       <w:r>
         <w:t>Al-Zarieni and Alkhresheh (2024) studied hedges and boosters in 30 linguistics M.A. thesis abstracts at Yarmouk University, following Hyland's (2005) interpersonal model. Hedges outnumbered boosters (117 to 60, or 66% to 34% of the combined set). Hedges were read as ways of limiting opposition risk, marking politeness, and presenting results cautiously. Boosters were used to assert originality and stress certainty. The study adds an Arabic L2 postgraduate linguistics sample to the abstract-focused record and shows that even language-focused programs still balance caution against certainty marking under abstract constraints.</w:t>
-      </w:r>
-    </w:p>
-    <w:p>
-      <w:r>
-        <w:t>Lingard, L. (2026). Rhetorical candour: When and how to say it straight in your academic manuscript. Perspectives on Medical Education, 15(1), 251–256. https://doi.org/10.5334/pme.2269</w:t>
       </w:r>
     </w:p>
     <w:p>
@@ -10517,6 +10512,11 @@
         <w:rPr>
           <w:rtl w:val="0"/>
         </w:rPr>
+      </w:r>
+    </w:p>
+    <w:p>
+      <w:r>
+        <w:t>Lingard, L. (2026). Rhetorical candour: When and how to say it straight in your academic manuscript. Perspectives on Medical Education, 15(1), 251–256. https://doi.org/10.5334/pme.2269</w:t>
       </w:r>
     </w:p>
     <w:p>

</xml_diff>

<commit_message>
Draft_111: add Token to Definition of Terms
</commit_message>
<xml_diff>
--- a/thesis/003_ThesisProposal_Draft_111_body.docx
+++ b/thesis/003_ThesisProposal_Draft_111_body.docx
@@ -2188,6 +2188,20 @@
           <w:rtl w:val="0"/>
         </w:rPr>
         <w:t>Softening, conceptually, is the reduction of force, directness, imposition, or interpersonal impact in a statement. Operationally, Step 2 tracks softening only on claims (statements about data, the world, or prior work that evidence could show to be wrong). Retained hedges are labeled epistemic caution and/or politeness/deference only, by the Working Test and Reader Test after the claim condition. Aims, directives, and routine procedures fail the claim condition by kind and are logged as false positives. The finding of no politeness/deference in this study refers to reader-oriented softening of claims, not to softened directives.</w:t>
+      </w:r>
+    </w:p>
+    <w:p>
+      <w:pPr>
+        <w:jc w:val="both"/>
+      </w:pPr>
+      <w:r>
+        <w:rPr>
+          <w:b/>
+        </w:rPr>
+        <w:t>Token</w:t>
+      </w:r>
+      <w:r>
+        <w:t>, conceptually, is a single occurrence of a linguistic form in a text, counted as an instance rather than as a distinct word type. Operationally, in this study a token is each coded instance of a hedge candidate recorded during analysis: a retained hedge after Stage 1 and Stage 2 checks, or a false positive that failed those checks. Totals such as 65 hedge tokens or 65 false-positive tokens refer to instance counts across the corpus, not to the number of different forms.</w:t>
       </w:r>
     </w:p>
     <w:p>

</xml_diff>

<commit_message>
Draft_111: add Takimoto to References (correct DOI); fix native writers slip
</commit_message>
<xml_diff>
--- a/thesis/003_ThesisProposal_Draft_111_body.docx
+++ b/thesis/003_ThesisProposal_Draft_111_body.docx
@@ -870,9 +870,10 @@
       </w:pPr>
       <w:r>
         <w:rPr>
-          <w:rFonts w:ascii="Georgia" w:hAnsi="Georgia" w:cs="Georgia"/>
-        </w:rPr>
-        <w:t>Takimoto (2015) adds a recognition layer. In a corpus comparison of academic essays by Japanese EFL learners and English L1 writers, the EFL group used more boosters than hedges and preferred straightforward, explicit expressions, whereas native writers were more tentative. A follow-up task suggested that certainty items were more visible to the learners than possibility and probability items, which they often misapprehended. Underuse of hedges can therefore coexist with limited pragmatic awareness of what the missing forms do. Luo (2021), in a systematic review of undergraduate English language learners' hedging, reaches a similar aggregate conclusion. ELLs generally use fewer hedges than English L1 writers, draw on a narrower inventory, and face combined challenges of academic experience and L2 form control.</w:t>
+          <w:rFonts w:ascii="Georgia" w:hAnsi="Georgia" w:cs="Georgia" w:eastAsia="Georgia"/>
+          <w:sz w:val="22"/>
+        </w:rPr>
+        <w:t>Takimoto (2015) adds a recognition layer. In a corpus comparison of academic essays by Japanese EFL learners and English L1 writers, the EFL group used more boosters than hedges and preferred straightforward, explicit expressions, whereas English L1 writers were more tentative. A follow-up task suggested that certainty items were more visible to the learners than possibility and probability items, which they often misapprehended. Underuse of hedges can therefore coexist with limited pragmatic awareness of what the missing forms do. Luo (2021), in a systematic review of undergraduate English language learners' hedging, reaches a similar aggregate conclusion. ELLs generally use fewer hedges than English L1 writers, draw on a narrower inventory, and face combined challenges of academic experience and L2 form control.</w:t>
       </w:r>
     </w:p>
     <w:p>
@@ -10794,6 +10795,19 @@
     <w:p>
       <w:r>
         <w:t>Sepehri, M., Hajijalili, M., &amp; Namaziandost, E. (2019). Hedges and boosters in medical and engineering research articles: A comparative corpus-based study. Global Journal of Foreign Language Teaching, 9(4), 203–213. https://doi.org/10.18844/gjflt.v9i4.4342</w:t>
+      </w:r>
+    </w:p>
+    <w:p>
+      <w:pPr>
+        <w:spacing w:line="480" w:lineRule="auto"/>
+        <w:ind w:left="720" w:hanging="720"/>
+      </w:pPr>
+      <w:r>
+        <w:rPr>
+          <w:rFonts w:ascii="Georgia" w:hAnsi="Georgia" w:eastAsia="Georgia"/>
+          <w:sz w:val="22"/>
+        </w:rPr>
+        <w:t>Takimoto, M. (2015). Assertions and lexical invisibility in EFL learners’ academic essays. Journal of Pragmatics, 89, 85–99. https://doi.org/10.1016/j.pragma.2015.09.009</w:t>
       </w:r>
     </w:p>
     <w:p>

</xml_diff>